<commit_message>
Fixed tests file and finished 2.a
</commit_message>
<xml_diff>
--- a/ex4.docx
+++ b/ex4.docx
@@ -579,13 +579,7 @@
           <w:rPr>
             <w:rFonts w:ascii="Cambria Math" w:eastAsiaTheme="minorEastAsia" w:hAnsi="Cambria Math"/>
           </w:rPr>
-          <m:t>+</m:t>
-        </m:r>
-        <m:r>
-          <w:rPr>
-            <w:rFonts w:ascii="Cambria Math" w:eastAsiaTheme="minorEastAsia" w:hAnsi="Cambria Math"/>
-          </w:rPr>
-          <m:t>2</m:t>
+          <m:t>+2</m:t>
         </m:r>
       </m:oMath>
       <w:r>
@@ -1029,19 +1023,7 @@
         <w:rPr>
           <w:rFonts w:eastAsiaTheme="minorEastAsia"/>
         </w:rPr>
-        <w:t>, tail], that is our (n+1)th value</w:t>
-      </w:r>
-      <w:r>
-        <w:rPr>
-          <w:rFonts w:eastAsiaTheme="minorEastAsia"/>
-        </w:rPr>
-        <w:t xml:space="preserve"> </w:t>
-      </w:r>
-      <w:r>
-        <w:rPr>
-          <w:rFonts w:eastAsiaTheme="minorEastAsia"/>
-        </w:rPr>
-        <w:t xml:space="preserve">from </w:t>
+        <w:t xml:space="preserve">, tail], that is our (n+1)th value from </w:t>
       </w:r>
       <w:r>
         <w:rPr>
@@ -1066,7 +1048,78 @@
     </w:p>
     <w:p>
       <w:r>
-        <w:t>The (n+1)th values are equal in both lazy-lists.</w:t>
+        <w:t>The (n+1)th values are equal in both lazy-lists</w:t>
+      </w:r>
+      <w:r>
+        <w:t>, we proved the induction.</w:t>
+      </w:r>
+    </w:p>
+    <w:p/>
+    <w:p/>
+    <w:p/>
+    <w:p>
+      <w:pPr>
+        <w:pStyle w:val="Heading2"/>
+      </w:pPr>
+      <w:r>
+        <w:lastRenderedPageBreak/>
+        <w:t>Question 2.a</w:t>
+      </w:r>
+    </w:p>
+    <w:p>
+      <w:r>
+        <w:t xml:space="preserve">Lets say F is a function and F$ is the </w:t>
+      </w:r>
+      <w:r>
+        <w:t>Success-Fail Continuation version</w:t>
+      </w:r>
+      <w:r>
+        <w:t>.</w:t>
+      </w:r>
+    </w:p>
+    <w:p>
+      <w:r>
+        <w:t>They are equal only if:</w:t>
+      </w:r>
+    </w:p>
+    <w:p>
+      <w:r>
+        <w:t>F: T1 -&gt; T2 | T_fail</w:t>
+      </w:r>
+    </w:p>
+    <w:p>
+      <w:r>
+        <w:t>And F$ is defined as:</w:t>
+      </w:r>
+    </w:p>
+    <w:p>
+      <w:r>
+        <w:t>F$: T1 * [T2 -&gt; T3] * [()-&gt; T3]</w:t>
+      </w:r>
+    </w:p>
+    <w:p>
+      <w:r>
+        <w:t>And for every input of type T1 lets call it X and any functions for success or failure, if F succeeded and returned value v, meaning F(X) =v then F$</w:t>
+      </w:r>
+      <w:r>
+        <w:t>(X,success,failure)</w:t>
+      </w:r>
+      <w:r>
+        <w:t xml:space="preserve"> must return </w:t>
+      </w:r>
+      <w:r>
+        <w:t>success(v).</w:t>
+      </w:r>
+    </w:p>
+    <w:p>
+      <w:r>
+        <w:t xml:space="preserve">If F fails on the input X, meaning F(X) = &lt;fail&gt; where &lt;fail&gt; is a value of T_fail (like `fail), </w:t>
+      </w:r>
+      <w:r>
+        <w:t>then F$(X,success,failure) must return</w:t>
+      </w:r>
+      <w:r>
+        <w:t xml:space="preserve"> failure().</w:t>
       </w:r>
     </w:p>
     <w:sectPr>
@@ -1779,7 +1832,6 @@
   <w:style w:type="character" w:default="1" w:styleId="DefaultParagraphFont">
     <w:name w:val="Default Paragraph Font"/>
     <w:uiPriority w:val="1"/>
-    <w:semiHidden/>
     <w:unhideWhenUsed/>
   </w:style>
   <w:style w:type="table" w:default="1" w:styleId="TableNormal">

</xml_diff>

<commit_message>
A lot of work on question 2
</commit_message>
<xml_diff>
--- a/ex4.docx
+++ b/ex4.docx
@@ -167,7 +167,15 @@
     </w:p>
     <w:p>
       <w:r>
-        <w:t xml:space="preserve">(cons-lzl </w:t>
+        <w:t>(cons-</w:t>
+      </w:r>
+      <w:proofErr w:type="spellStart"/>
+      <w:r>
+        <w:t>lzl</w:t>
+      </w:r>
+      <w:proofErr w:type="spellEnd"/>
+      <w:r>
+        <w:t xml:space="preserve"> </w:t>
       </w:r>
     </w:p>
     <w:p>
@@ -175,7 +183,15 @@
         <w:ind w:firstLine="720"/>
       </w:pPr>
       <w:r>
-        <w:t xml:space="preserve">(head lzl) </w:t>
+        <w:t xml:space="preserve">(head </w:t>
+      </w:r>
+      <w:proofErr w:type="spellStart"/>
+      <w:r>
+        <w:t>lzl</w:t>
+      </w:r>
+      <w:proofErr w:type="spellEnd"/>
+      <w:r>
+        <w:t xml:space="preserve">) </w:t>
       </w:r>
     </w:p>
     <w:p>
@@ -191,7 +207,23 @@
         <w:ind w:left="720" w:firstLine="720"/>
       </w:pPr>
       <w:r>
-        <w:t>(lzl-filter p (tail lzl))</w:t>
+        <w:t>(</w:t>
+      </w:r>
+      <w:proofErr w:type="spellStart"/>
+      <w:r>
+        <w:t>lzl</w:t>
+      </w:r>
+      <w:proofErr w:type="spellEnd"/>
+      <w:r>
+        <w:t xml:space="preserve">-filter p (tail </w:t>
+      </w:r>
+      <w:proofErr w:type="spellStart"/>
+      <w:r>
+        <w:t>lzl</w:t>
+      </w:r>
+      <w:proofErr w:type="spellEnd"/>
+      <w:r>
+        <w:t>))</w:t>
       </w:r>
     </w:p>
     <w:p>
@@ -287,7 +319,15 @@
         <w:t>as well</w:t>
       </w:r>
       <w:r>
-        <w:t>, meaning the (n+1)th head values</w:t>
+        <w:t>, meaning the (n+1)</w:t>
+      </w:r>
+      <w:proofErr w:type="spellStart"/>
+      <w:r>
+        <w:t>th</w:t>
+      </w:r>
+      <w:proofErr w:type="spellEnd"/>
+      <w:r>
+        <w:t xml:space="preserve"> head values</w:t>
       </w:r>
       <w:r>
         <w:t xml:space="preserve"> of the returned lazy-list</w:t>
@@ -851,7 +891,21 @@
         <w:rPr>
           <w:rFonts w:eastAsiaTheme="minorEastAsia"/>
         </w:rPr>
-        <w:t xml:space="preserve">which again we know is odd. So when `tail lzl` is executed this value will not pass the predicate as it is not even. </w:t>
+        <w:t xml:space="preserve">which again we know is odd. So when `tail </w:t>
+      </w:r>
+      <w:proofErr w:type="spellStart"/>
+      <w:r>
+        <w:rPr>
+          <w:rFonts w:eastAsiaTheme="minorEastAsia"/>
+        </w:rPr>
+        <w:t>lzl</w:t>
+      </w:r>
+      <w:proofErr w:type="spellEnd"/>
+      <w:r>
+        <w:rPr>
+          <w:rFonts w:eastAsiaTheme="minorEastAsia"/>
+        </w:rPr>
+        <w:t xml:space="preserve">` is executed this value will not pass the predicate as it is not even. </w:t>
       </w:r>
     </w:p>
     <w:p>
@@ -1048,7 +1102,15 @@
     </w:p>
     <w:p>
       <w:r>
-        <w:t>The (n+1)th values are equal in both lazy-lists</w:t>
+        <w:t>The (n+1)</w:t>
+      </w:r>
+      <w:proofErr w:type="spellStart"/>
+      <w:r>
+        <w:t>th</w:t>
+      </w:r>
+      <w:proofErr w:type="spellEnd"/>
+      <w:r>
+        <w:t xml:space="preserve"> values are equal in both lazy-lists</w:t>
       </w:r>
       <w:r>
         <w:t>, we proved the induction.</w:t>
@@ -1067,8 +1129,13 @@
       </w:r>
     </w:p>
     <w:p>
-      <w:r>
-        <w:t xml:space="preserve">Lets say F is a function and F$ is the </w:t>
+      <w:proofErr w:type="spellStart"/>
+      <w:r>
+        <w:t>Lets</w:t>
+      </w:r>
+      <w:proofErr w:type="spellEnd"/>
+      <w:r>
+        <w:t xml:space="preserve"> say F is a function and F$ is the </w:t>
       </w:r>
       <w:r>
         <w:t>Success-Fail Continuation version</w:t>
@@ -1084,8 +1151,13 @@
     </w:p>
     <w:p>
       <w:r>
-        <w:t>F: T1 -&gt; T2 | T_fail</w:t>
-      </w:r>
+        <w:t xml:space="preserve">F: T1 -&gt; T2 | </w:t>
+      </w:r>
+      <w:proofErr w:type="spellStart"/>
+      <w:r>
+        <w:t>T_fail</w:t>
+      </w:r>
+      <w:proofErr w:type="spellEnd"/>
     </w:p>
     <w:p>
       <w:r>
@@ -1099,10 +1171,26 @@
     </w:p>
     <w:p>
       <w:r>
-        <w:t>And for every input of type T1 lets call it X and any functions for success or failure, if F succeeded and returned value v, meaning F(X) =v then F$</w:t>
-      </w:r>
-      <w:r>
-        <w:t>(X,success,failure)</w:t>
+        <w:t xml:space="preserve">And for every input of type T1 </w:t>
+      </w:r>
+      <w:proofErr w:type="spellStart"/>
+      <w:r>
+        <w:t>lets</w:t>
+      </w:r>
+      <w:proofErr w:type="spellEnd"/>
+      <w:r>
+        <w:t xml:space="preserve"> call it X and any functions for success or failure, if F succeeded and returned value v, meaning F(X) =v then F$</w:t>
+      </w:r>
+      <w:r>
+        <w:t>(</w:t>
+      </w:r>
+      <w:proofErr w:type="spellStart"/>
+      <w:r>
+        <w:t>X,success,failure</w:t>
+      </w:r>
+      <w:proofErr w:type="spellEnd"/>
+      <w:r>
+        <w:t>)</w:t>
       </w:r>
       <w:r>
         <w:t xml:space="preserve"> must return </w:t>
@@ -1113,13 +1201,387 @@
     </w:p>
     <w:p>
       <w:r>
-        <w:t xml:space="preserve">If F fails on the input X, meaning F(X) = &lt;fail&gt; where &lt;fail&gt; is a value of T_fail (like `fail), </w:t>
-      </w:r>
-      <w:r>
-        <w:t>then F$(X,success,failure) must return</w:t>
-      </w:r>
-      <w:r>
-        <w:t xml:space="preserve"> failure().</w:t>
+        <w:t xml:space="preserve">If F fails on the input X, meaning F(X) = &lt;fail&gt; where &lt;fail&gt; is a value of </w:t>
+      </w:r>
+      <w:proofErr w:type="spellStart"/>
+      <w:r>
+        <w:t>T_fail</w:t>
+      </w:r>
+      <w:proofErr w:type="spellEnd"/>
+      <w:r>
+        <w:t xml:space="preserve"> (like `fail), then F$(</w:t>
+      </w:r>
+      <w:proofErr w:type="spellStart"/>
+      <w:r>
+        <w:t>X,success,failure</w:t>
+      </w:r>
+      <w:proofErr w:type="spellEnd"/>
+      <w:r>
+        <w:t>) must return failure().</w:t>
+      </w:r>
+    </w:p>
+    <w:p/>
+    <w:p>
+      <w:pPr>
+        <w:pStyle w:val="Heading2"/>
+      </w:pPr>
+      <w:r>
+        <w:t>Question 2.b</w:t>
+      </w:r>
+    </w:p>
+    <w:p>
+      <w:r>
+        <w:t>We will prove they are equal by looking at every scenario of the association list.</w:t>
+      </w:r>
+    </w:p>
+    <w:p>
+      <w:pPr>
+        <w:pStyle w:val="ListParagraph"/>
+        <w:numPr>
+          <w:ilvl w:val="0"/>
+          <w:numId w:val="2"/>
+        </w:numPr>
+      </w:pPr>
+      <w:r>
+        <w:t>List is empty</w:t>
+      </w:r>
+      <w:r>
+        <w:br/>
+        <w:t>In both functions the condition of “empty?” will return true.</w:t>
+      </w:r>
+    </w:p>
+    <w:p>
+      <w:pPr>
+        <w:pStyle w:val="ListParagraph"/>
+        <w:numPr>
+          <w:ilvl w:val="1"/>
+          <w:numId w:val="2"/>
+        </w:numPr>
+      </w:pPr>
+      <w:r>
+        <w:t xml:space="preserve">get-value will return </w:t>
+      </w:r>
+      <w:r>
+        <w:rPr>
+          <w:color w:val="EE0000"/>
+        </w:rPr>
+        <w:t>‘fail</w:t>
+      </w:r>
+      <w:r>
+        <w:t>.</w:t>
+      </w:r>
+    </w:p>
+    <w:p>
+      <w:pPr>
+        <w:pStyle w:val="ListParagraph"/>
+        <w:numPr>
+          <w:ilvl w:val="1"/>
+          <w:numId w:val="2"/>
+        </w:numPr>
+      </w:pPr>
+      <w:r>
+        <w:t xml:space="preserve">get-value$ will return the value of the failure continuation function </w:t>
+      </w:r>
+      <w:r>
+        <w:rPr>
+          <w:color w:val="EE0000"/>
+        </w:rPr>
+        <w:t>fail</w:t>
+      </w:r>
+      <w:r>
+        <w:t>.</w:t>
+      </w:r>
+    </w:p>
+    <w:p>
+      <w:pPr>
+        <w:pStyle w:val="ListParagraph"/>
+        <w:numPr>
+          <w:ilvl w:val="0"/>
+          <w:numId w:val="2"/>
+        </w:numPr>
+      </w:pPr>
+      <w:r>
+        <w:t>List is not empty</w:t>
+      </w:r>
+      <w:r>
+        <w:t>,</w:t>
+      </w:r>
+      <w:r>
+        <w:t xml:space="preserve"> and </w:t>
+      </w:r>
+      <w:r>
+        <w:t xml:space="preserve">in </w:t>
+      </w:r>
+      <w:r>
+        <w:t>the first pair in the list</w:t>
+      </w:r>
+      <w:r>
+        <w:t>, the</w:t>
+      </w:r>
+      <w:r>
+        <w:t xml:space="preserve"> </w:t>
+      </w:r>
+      <w:r>
+        <w:t>key is the key we are looking for.</w:t>
+      </w:r>
+      <w:r>
+        <w:br/>
+        <w:t>Both functions will pass the condition eq?</w:t>
+      </w:r>
+    </w:p>
+    <w:p>
+      <w:pPr>
+        <w:pStyle w:val="ListParagraph"/>
+        <w:numPr>
+          <w:ilvl w:val="1"/>
+          <w:numId w:val="2"/>
+        </w:numPr>
+      </w:pPr>
+      <w:r>
+        <w:t xml:space="preserve">get-value will return the </w:t>
+      </w:r>
+      <w:r>
+        <w:rPr>
+          <w:color w:val="0E2841" w:themeColor="text2"/>
+        </w:rPr>
+        <w:t>value of the pair</w:t>
+      </w:r>
+      <w:r>
+        <w:t>.</w:t>
+      </w:r>
+    </w:p>
+    <w:p>
+      <w:pPr>
+        <w:pStyle w:val="ListParagraph"/>
+        <w:numPr>
+          <w:ilvl w:val="1"/>
+          <w:numId w:val="2"/>
+        </w:numPr>
+      </w:pPr>
+      <w:r>
+        <w:t xml:space="preserve">get-value$ will return the value of the </w:t>
+      </w:r>
+      <w:r>
+        <w:t>succes</w:t>
+      </w:r>
+      <w:r>
+        <w:t>s</w:t>
+      </w:r>
+      <w:r>
+        <w:t xml:space="preserve"> continuation function </w:t>
+      </w:r>
+      <w:r>
+        <w:rPr>
+          <w:color w:val="196B24" w:themeColor="accent3"/>
+        </w:rPr>
+        <w:t>success</w:t>
+      </w:r>
+      <w:r>
+        <w:rPr>
+          <w:color w:val="196B24" w:themeColor="accent3"/>
+        </w:rPr>
+        <w:t xml:space="preserve"> </w:t>
+      </w:r>
+      <w:r>
+        <w:t xml:space="preserve">and the input for </w:t>
+      </w:r>
+      <w:r>
+        <w:rPr>
+          <w:color w:val="196B24" w:themeColor="accent3"/>
+        </w:rPr>
+        <w:t xml:space="preserve">success </w:t>
+      </w:r>
+      <w:r>
+        <w:t xml:space="preserve">will be the </w:t>
+      </w:r>
+      <w:r>
+        <w:rPr>
+          <w:color w:val="0E2841" w:themeColor="text2"/>
+        </w:rPr>
+        <w:t>value of the pair</w:t>
+      </w:r>
+      <w:r>
+        <w:t>.</w:t>
+      </w:r>
+    </w:p>
+    <w:p>
+      <w:pPr>
+        <w:pStyle w:val="ListParagraph"/>
+        <w:numPr>
+          <w:ilvl w:val="0"/>
+          <w:numId w:val="2"/>
+        </w:numPr>
+      </w:pPr>
+      <w:r>
+        <w:t>List is not empty, and in the first pair in the list, the key is</w:t>
+      </w:r>
+      <w:r>
+        <w:t xml:space="preserve"> </w:t>
+      </w:r>
+      <w:r>
+        <w:rPr>
+          <w:color w:val="EE0000"/>
+        </w:rPr>
+        <w:t>not</w:t>
+      </w:r>
+      <w:r>
+        <w:t xml:space="preserve"> the key we are looking for.</w:t>
+      </w:r>
+      <w:r>
+        <w:br/>
+        <w:t>Both functions will get to the “else” condition.</w:t>
+      </w:r>
+    </w:p>
+    <w:p>
+      <w:pPr>
+        <w:pStyle w:val="ListParagraph"/>
+        <w:numPr>
+          <w:ilvl w:val="1"/>
+          <w:numId w:val="2"/>
+        </w:numPr>
+      </w:pPr>
+      <w:r>
+        <w:t>get-value will return the result of get-value with the input being:</w:t>
+      </w:r>
+    </w:p>
+    <w:p>
+      <w:pPr>
+        <w:pStyle w:val="ListParagraph"/>
+        <w:numPr>
+          <w:ilvl w:val="2"/>
+          <w:numId w:val="2"/>
+        </w:numPr>
+      </w:pPr>
+      <w:r>
+        <w:t>the rest of the list (</w:t>
+      </w:r>
+      <w:proofErr w:type="spellStart"/>
+      <w:r>
+        <w:t>cdr</w:t>
+      </w:r>
+      <w:proofErr w:type="spellEnd"/>
+      <w:r>
+        <w:t>)</w:t>
+      </w:r>
+    </w:p>
+    <w:p>
+      <w:pPr>
+        <w:pStyle w:val="ListParagraph"/>
+        <w:numPr>
+          <w:ilvl w:val="2"/>
+          <w:numId w:val="2"/>
+        </w:numPr>
+      </w:pPr>
+      <w:r>
+        <w:t>the same key as the current input.</w:t>
+      </w:r>
+    </w:p>
+    <w:p>
+      <w:pPr>
+        <w:pStyle w:val="ListParagraph"/>
+        <w:numPr>
+          <w:ilvl w:val="1"/>
+          <w:numId w:val="2"/>
+        </w:numPr>
+      </w:pPr>
+      <w:r>
+        <w:t xml:space="preserve"> </w:t>
+      </w:r>
+      <w:r>
+        <w:t>get-value will return the result of get-value with the input being:</w:t>
+      </w:r>
+    </w:p>
+    <w:p>
+      <w:pPr>
+        <w:pStyle w:val="ListParagraph"/>
+        <w:numPr>
+          <w:ilvl w:val="2"/>
+          <w:numId w:val="2"/>
+        </w:numPr>
+      </w:pPr>
+      <w:r>
+        <w:t>the rest of the list (</w:t>
+      </w:r>
+      <w:proofErr w:type="spellStart"/>
+      <w:r>
+        <w:t>cdr</w:t>
+      </w:r>
+      <w:proofErr w:type="spellEnd"/>
+      <w:r>
+        <w:t>)</w:t>
+      </w:r>
+    </w:p>
+    <w:p>
+      <w:pPr>
+        <w:pStyle w:val="ListParagraph"/>
+        <w:numPr>
+          <w:ilvl w:val="2"/>
+          <w:numId w:val="2"/>
+        </w:numPr>
+      </w:pPr>
+      <w:r>
+        <w:t>the same key as the current input.</w:t>
+      </w:r>
+    </w:p>
+    <w:p>
+      <w:pPr>
+        <w:pStyle w:val="ListParagraph"/>
+        <w:numPr>
+          <w:ilvl w:val="2"/>
+          <w:numId w:val="2"/>
+        </w:numPr>
+      </w:pPr>
+      <w:r>
+        <w:lastRenderedPageBreak/>
+        <w:t>The same success continuation function as the current input.</w:t>
+      </w:r>
+    </w:p>
+    <w:p>
+      <w:pPr>
+        <w:pStyle w:val="ListParagraph"/>
+        <w:numPr>
+          <w:ilvl w:val="2"/>
+          <w:numId w:val="2"/>
+        </w:numPr>
+      </w:pPr>
+      <w:r>
+        <w:t xml:space="preserve">The same </w:t>
+      </w:r>
+      <w:r>
+        <w:t>failure</w:t>
+      </w:r>
+      <w:r>
+        <w:t xml:space="preserve"> continuation function as the current input.</w:t>
+      </w:r>
+    </w:p>
+    <w:p>
+      <w:r>
+        <w:t>As we can see, in all situations we get the required behavior that we defined in 2.a</w:t>
+      </w:r>
+      <w:r>
+        <w:t>.</w:t>
+      </w:r>
+    </w:p>
+    <w:p>
+      <w:r>
+        <w:t>In case 3 both functions will continue on the rest of list (</w:t>
+      </w:r>
+      <w:proofErr w:type="spellStart"/>
+      <w:r>
+        <w:t>cdr</w:t>
+      </w:r>
+      <w:proofErr w:type="spellEnd"/>
+      <w:r>
+        <w:t>), but will eventually both stop on case 1 or 2 (</w:t>
+      </w:r>
+      <w:r>
+        <w:t>assuming the list is of finite length</w:t>
+      </w:r>
+      <w:r>
+        <w:t>)</w:t>
+      </w:r>
+      <w:r>
+        <w:t>.</w:t>
       </w:r>
     </w:p>
     <w:sectPr>
@@ -1135,9 +1597,9 @@
 <file path=word/numbering.xml><?xml version="1.0" encoding="utf-8"?>
 <w:numbering xmlns:wpc="http://schemas.microsoft.com/office/word/2010/wordprocessingCanvas" xmlns:cx="http://schemas.microsoft.com/office/drawing/2014/chartex" xmlns:cx1="http://schemas.microsoft.com/office/drawing/2015/9/8/chartex" xmlns:cx2="http://schemas.microsoft.com/office/drawing/2015/10/21/chartex" xmlns:cx3="http://schemas.microsoft.com/office/drawing/2016/5/9/chartex" xmlns:cx4="http://schemas.microsoft.com/office/drawing/2016/5/10/chartex" xmlns:cx5="http://schemas.microsoft.com/office/drawing/2016/5/11/chartex" xmlns:cx6="http://schemas.microsoft.com/office/drawing/2016/5/12/chartex" xmlns:cx7="http://schemas.microsoft.com/office/drawing/2016/5/13/chartex" xmlns:cx8="http://schemas.microsoft.com/office/drawing/2016/5/14/chartex" xmlns:mc="http://schemas.openxmlformats.org/markup-compatibility/2006" xmlns:aink="http://schemas.microsoft.com/office/drawing/2016/ink" xmlns:am3d="http://schemas.microsoft.com/office/drawing/2017/model3d" xmlns:o="urn:schemas-microsoft-com:office:office" xmlns:oel="http://schemas.microsoft.com/office/2019/extlst" xmlns:r="http://schemas.openxmlformats.org/officeDocument/2006/relationships" xmlns:m="http://schemas.openxmlformats.org/officeDocument/2006/math" xmlns:v="urn:schemas-microsoft-com:vml" xmlns:wp14="http://schemas.microsoft.com/office/word/2010/wordprocessingDrawing" xmlns:wp="http://schemas.openxmlformats.org/drawingml/2006/wordprocessingDrawing" xmlns:w10="urn:schemas-microsoft-com:office:word" xmlns:w="http://schemas.openxmlformats.org/wordprocessingml/2006/main" xmlns:w14="http://schemas.microsoft.com/office/word/2010/wordml" xmlns:w15="http://schemas.microsoft.com/office/word/2012/wordml" xmlns:w16cex="http://schemas.microsoft.com/office/word/2018/wordml/cex" xmlns:w16cid="http://schemas.microsoft.com/office/word/2016/wordml/cid" xmlns:w16="http://schemas.microsoft.com/office/word/2018/wordml" xmlns:w16du="http://schemas.microsoft.com/office/word/2023/wordml/word16du" xmlns:w16sdtdh="http://schemas.microsoft.com/office/word/2020/wordml/sdtdatahash" xmlns:w16sdtfl="http://schemas.microsoft.com/office/word/2024/wordml/sdtformatlock" xmlns:w16se="http://schemas.microsoft.com/office/word/2015/wordml/symex" xmlns:wpg="http://schemas.microsoft.com/office/word/2010/wordprocessingGroup" xmlns:wpi="http://schemas.microsoft.com/office/word/2010/wordprocessingInk" xmlns:wne="http://schemas.microsoft.com/office/word/2006/wordml" xmlns:wps="http://schemas.microsoft.com/office/word/2010/wordprocessingShape" mc:Ignorable="w14 w15 w16se w16cid w16 w16cex w16sdtdh w16sdtfl w16du wp14">
   <w:abstractNum w:abstractNumId="0" w15:restartNumberingAfterBreak="0">
-    <w:nsid w:val="7F412A1E"/>
+    <w:nsid w:val="09A236BA"/>
     <w:multiLevelType w:val="hybridMultilevel"/>
-    <w:tmpl w:val="87BE0408"/>
+    <w:tmpl w:val="566621DE"/>
     <w:lvl w:ilvl="0" w:tplc="0409000F">
       <w:start w:val="1"/>
       <w:numFmt w:val="decimal"/>
@@ -1223,7 +1685,99 @@
       </w:pPr>
     </w:lvl>
   </w:abstractNum>
+  <w:abstractNum w:abstractNumId="1" w15:restartNumberingAfterBreak="0">
+    <w:nsid w:val="7F412A1E"/>
+    <w:multiLevelType w:val="hybridMultilevel"/>
+    <w:tmpl w:val="87BE0408"/>
+    <w:lvl w:ilvl="0" w:tplc="0409000F">
+      <w:start w:val="1"/>
+      <w:numFmt w:val="decimal"/>
+      <w:lvlText w:val="%1."/>
+      <w:lvlJc w:val="left"/>
+      <w:pPr>
+        <w:ind w:left="720" w:hanging="360"/>
+      </w:pPr>
+      <w:rPr>
+        <w:rFonts w:hint="default"/>
+      </w:rPr>
+    </w:lvl>
+    <w:lvl w:ilvl="1" w:tplc="04090019">
+      <w:start w:val="1"/>
+      <w:numFmt w:val="lowerLetter"/>
+      <w:lvlText w:val="%2."/>
+      <w:lvlJc w:val="left"/>
+      <w:pPr>
+        <w:ind w:left="1440" w:hanging="360"/>
+      </w:pPr>
+    </w:lvl>
+    <w:lvl w:ilvl="2" w:tplc="0409001B">
+      <w:start w:val="1"/>
+      <w:numFmt w:val="lowerRoman"/>
+      <w:lvlText w:val="%3."/>
+      <w:lvlJc w:val="right"/>
+      <w:pPr>
+        <w:ind w:left="2160" w:hanging="180"/>
+      </w:pPr>
+    </w:lvl>
+    <w:lvl w:ilvl="3" w:tplc="0409000F" w:tentative="1">
+      <w:start w:val="1"/>
+      <w:numFmt w:val="decimal"/>
+      <w:lvlText w:val="%4."/>
+      <w:lvlJc w:val="left"/>
+      <w:pPr>
+        <w:ind w:left="2880" w:hanging="360"/>
+      </w:pPr>
+    </w:lvl>
+    <w:lvl w:ilvl="4" w:tplc="04090019" w:tentative="1">
+      <w:start w:val="1"/>
+      <w:numFmt w:val="lowerLetter"/>
+      <w:lvlText w:val="%5."/>
+      <w:lvlJc w:val="left"/>
+      <w:pPr>
+        <w:ind w:left="3600" w:hanging="360"/>
+      </w:pPr>
+    </w:lvl>
+    <w:lvl w:ilvl="5" w:tplc="0409001B" w:tentative="1">
+      <w:start w:val="1"/>
+      <w:numFmt w:val="lowerRoman"/>
+      <w:lvlText w:val="%6."/>
+      <w:lvlJc w:val="right"/>
+      <w:pPr>
+        <w:ind w:left="4320" w:hanging="180"/>
+      </w:pPr>
+    </w:lvl>
+    <w:lvl w:ilvl="6" w:tplc="0409000F" w:tentative="1">
+      <w:start w:val="1"/>
+      <w:numFmt w:val="decimal"/>
+      <w:lvlText w:val="%7."/>
+      <w:lvlJc w:val="left"/>
+      <w:pPr>
+        <w:ind w:left="5040" w:hanging="360"/>
+      </w:pPr>
+    </w:lvl>
+    <w:lvl w:ilvl="7" w:tplc="04090019" w:tentative="1">
+      <w:start w:val="1"/>
+      <w:numFmt w:val="lowerLetter"/>
+      <w:lvlText w:val="%8."/>
+      <w:lvlJc w:val="left"/>
+      <w:pPr>
+        <w:ind w:left="5760" w:hanging="360"/>
+      </w:pPr>
+    </w:lvl>
+    <w:lvl w:ilvl="8" w:tplc="0409001B" w:tentative="1">
+      <w:start w:val="1"/>
+      <w:numFmt w:val="lowerRoman"/>
+      <w:lvlText w:val="%9."/>
+      <w:lvlJc w:val="right"/>
+      <w:pPr>
+        <w:ind w:left="6480" w:hanging="180"/>
+      </w:pPr>
+    </w:lvl>
+  </w:abstractNum>
   <w:num w:numId="1" w16cid:durableId="1878351959">
+    <w:abstractNumId w:val="1"/>
+  </w:num>
+  <w:num w:numId="2" w16cid:durableId="846137101">
     <w:abstractNumId w:val="0"/>
   </w:num>
 </w:numbering>
@@ -1832,6 +2386,7 @@
   <w:style w:type="character" w:default="1" w:styleId="DefaultParagraphFont">
     <w:name w:val="Default Paragraph Font"/>
     <w:uiPriority w:val="1"/>
+    <w:semiHidden/>
     <w:unhideWhenUsed/>
   </w:style>
   <w:style w:type="table" w:default="1" w:styleId="TableNormal">

</xml_diff>